<commit_message>
docs(decisions): mise a jour du recensement des bibliotheques libertaires
</commit_message>
<xml_diff>
--- a/docs/decisions/AnarBib_recensement_bibliotheques_libertaires.docx
+++ b/docs/decisions/AnarBib_recensement_bibliotheques_libertaires.docx
@@ -28,7 +28,7 @@
         </w:p>
       </w:sdtContent>
     </w:sdt>
-    <w:bookmarkStart w:id="57" w:name="Xec567f22617bf15f11a6aa0e355172ddfe70684"/>
+    <w:bookmarkStart w:id="58" w:name="Xec567f22617bf15f11a6aa0e355172ddfe70684"/>
     <w:p>
       <w:pPr>
         <w:pStyle w:val="Heading1"/>
@@ -330,7 +330,7 @@
           <w:bCs/>
           <w:b/>
         </w:rPr>
-        <w:t xml:space="preserve">97 lieux</w:t>
+        <w:t xml:space="preserve">100 lieux</w:t>
       </w:r>
       <w:r>
         <w:t xml:space="preserve"> </w:t>
@@ -346,7 +346,7 @@
           <w:bCs/>
           <w:b/>
         </w:rPr>
-        <w:t xml:space="preserve">23 pays</w:t>
+        <w:t xml:space="preserve">24 pays</w:t>
       </w:r>
       <w:r>
         <w:t xml:space="preserve"> </w:t>
@@ -442,7 +442,7 @@
               <w:jc w:val="left"/>
             </w:pPr>
             <w:r>
-              <w:t xml:space="preserve">62</w:t>
+              <w:t xml:space="preserve">63</w:t>
             </w:r>
           </w:p>
         </w:tc>
@@ -518,7 +518,7 @@
               <w:jc w:val="left"/>
             </w:pPr>
             <w:r>
-              <w:t xml:space="preserve">19</w:t>
+              <w:t xml:space="preserve">21</w:t>
             </w:r>
           </w:p>
         </w:tc>
@@ -530,7 +530,7 @@
               <w:jc w:val="left"/>
             </w:pPr>
             <w:r>
-              <w:t xml:space="preserve">Argentine, Brésil, Chili, Cuba, Mexique, Uruguay</w:t>
+              <w:t xml:space="preserve">Argentine, Brésil, Chili, Cuba, Mexique, Paraguay, Uruguay</w:t>
             </w:r>
           </w:p>
         </w:tc>
@@ -1820,7 +1820,7 @@
     <w:bookmarkEnd w:id="24"/>
     <w:bookmarkEnd w:id="25"/>
     <w:bookmarkEnd w:id="26"/>
-    <w:bookmarkStart w:id="55" w:name="recensement-détaillé"/>
+    <w:bookmarkStart w:id="56" w:name="recensement-détaillé"/>
     <w:p>
       <w:pPr>
         <w:pStyle w:val="Heading2"/>
@@ -2279,6 +2279,52 @@
       </w:r>
       <w:r>
         <w:t xml:space="preserve">Bibliothèque et archive anarchiste bruxelloise.</w:t>
+      </w:r>
+    </w:p>
+    <w:p>
+      <w:pPr>
+        <w:pStyle w:val="BodyText"/>
+      </w:pPr>
+      <w:r>
+        <w:rPr>
+          <w:bCs/>
+          <w:b/>
+        </w:rPr>
+        <w:t xml:space="preserve">La B.O.U.M. — Bibliothèque Anarchiste</w:t>
+      </w:r>
+      <w:r>
+        <w:br/>
+      </w:r>
+      <w:r>
+        <w:rPr>
+          <w:iCs/>
+          <w:i/>
+        </w:rPr>
+        <w:t xml:space="preserve">Bibliothèque — Bruxelles</w:t>
+      </w:r>
+      <w:r>
+        <w:br/>
+      </w:r>
+      <w:r>
+        <w:t xml:space="preserve">Adresse : Boom Café, rue Pletinckx 7, 1000 Bruxelles</w:t>
+      </w:r>
+      <w:r>
+        <w:br/>
+      </w:r>
+      <w:r>
+        <w:t xml:space="preserve">Site : https://stuut.info/+-boum-+ · Courriel : bibli-anar-bxl@proton.me</w:t>
+      </w:r>
+      <w:r>
+        <w:br/>
+      </w:r>
+      <w:r>
+        <w:t xml:space="preserve">Coordonnées : 50.8478, 4.3463 (adresse géocodée) · Réseau : ABABA · Langues du fonds : fr</w:t>
+      </w:r>
+      <w:r>
+        <w:br/>
+      </w:r>
+      <w:r>
+        <w:t xml:space="preserve">Bibliothèque anarchiste publique et participative au Boom Café, centre de Bruxelles, depuis 2023. Permanences-emprunts le jeudi 18h-21h, consultation sur place mer.-dim. 15h-21h. Infokiosque de brochures et zines. Catalogue en ligne sur inventaire.io. Fait suite aux librairies Zotte Morgen puis Acrata. Membre de l’ABABA, Amicale des Bibliothèques Autogérées de Bruxelles et Alentours (catalogue mutualisé sur inventaire.io).</w:t>
       </w:r>
     </w:p>
     <w:bookmarkEnd w:id="29"/>
@@ -5267,7 +5313,7 @@
     </w:p>
     <w:bookmarkEnd w:id="41"/>
     <w:bookmarkEnd w:id="42"/>
-    <w:bookmarkStart w:id="49" w:name="amérique-latine"/>
+    <w:bookmarkStart w:id="50" w:name="amérique-latine"/>
     <w:p>
       <w:pPr>
         <w:pStyle w:val="Heading3"/>
@@ -5415,6 +5461,52 @@
       </w:r>
       <w:r>
         <w:t xml:space="preserve">Siège historique de la FLA, bibliothèque et archives du mouvement libertaire argentin.</w:t>
+      </w:r>
+    </w:p>
+    <w:p>
+      <w:pPr>
+        <w:pStyle w:val="BodyText"/>
+      </w:pPr>
+      <w:r>
+        <w:rPr>
+          <w:bCs/>
+          <w:b/>
+        </w:rPr>
+        <w:t xml:space="preserve">Biblioteca Anarquista de Córdoba</w:t>
+      </w:r>
+      <w:r>
+        <w:br/>
+      </w:r>
+      <w:r>
+        <w:rPr>
+          <w:iCs/>
+          <w:i/>
+        </w:rPr>
+        <w:t xml:space="preserve">Bibliothèque — Córdoba</w:t>
+      </w:r>
+      <w:r>
+        <w:br/>
+      </w:r>
+      <w:r>
+        <w:t xml:space="preserve">Adresse : Amado Nervo 601, Córdoba</w:t>
+      </w:r>
+      <w:r>
+        <w:br/>
+      </w:r>
+      <w:r>
+        <w:t xml:space="preserve">Site : https://www.instagram.com/biblioteca.anarquista.cordoba/</w:t>
+      </w:r>
+      <w:r>
+        <w:br/>
+      </w:r>
+      <w:r>
+        <w:t xml:space="preserve">Coordonnées : -31.409, -64.181 (adresse géocodée) · Langues du fonds : es</w:t>
+      </w:r>
+      <w:r>
+        <w:br/>
+      </w:r>
+      <w:r>
+        <w:t xml:space="preserve">Bibliothèque anarchiste de Córdoba (Argentine), point de diffusion de presse et d’éditions libertaires.</w:t>
       </w:r>
     </w:p>
     <w:p>
@@ -6054,12 +6146,68 @@
       </w:r>
     </w:p>
     <w:bookmarkEnd w:id="47"/>
-    <w:bookmarkStart w:id="48" w:name="uruguay"/>
+    <w:bookmarkStart w:id="48" w:name="paraguay"/>
     <w:p>
       <w:pPr>
         <w:pStyle w:val="Heading4"/>
       </w:pPr>
       <w:r>
+        <w:t xml:space="preserve">Paraguay</w:t>
+      </w:r>
+    </w:p>
+    <w:p>
+      <w:pPr>
+        <w:pStyle w:val="FirstParagraph"/>
+      </w:pPr>
+      <w:r>
+        <w:rPr>
+          <w:bCs/>
+          <w:b/>
+        </w:rPr>
+        <w:t xml:space="preserve">Biblioteca Anarquista Despertar</w:t>
+      </w:r>
+      <w:r>
+        <w:br/>
+      </w:r>
+      <w:r>
+        <w:rPr>
+          <w:iCs/>
+          <w:i/>
+        </w:rPr>
+        <w:t xml:space="preserve">Bibliothèque — Asunción</w:t>
+      </w:r>
+      <w:r>
+        <w:br/>
+      </w:r>
+      <w:r>
+        <w:t xml:space="preserve">Adresse : Asunción</w:t>
+      </w:r>
+      <w:r>
+        <w:br/>
+      </w:r>
+      <w:r>
+        <w:t xml:space="preserve">Site : https://www.facebook.com/biblioteka.anarkista</w:t>
+      </w:r>
+      <w:r>
+        <w:br/>
+      </w:r>
+      <w:r>
+        <w:t xml:space="preserve">Coordonnées : -25.282, -57.635 (localisation à l’échelle de la ville) · Langues du fonds : es</w:t>
+      </w:r>
+      <w:r>
+        <w:br/>
+      </w:r>
+      <w:r>
+        <w:t xml:space="preserve">Bibliothèque anarchiste d’Asunción. Son nom fait écho à El Despertar, premier journal ouvrier anarchiste du Paraguay (1906-1907). Adresse précise à confirmer.</w:t>
+      </w:r>
+    </w:p>
+    <w:bookmarkEnd w:id="48"/>
+    <w:bookmarkStart w:id="49" w:name="uruguay"/>
+    <w:p>
+      <w:pPr>
+        <w:pStyle w:val="Heading4"/>
+      </w:pPr>
+      <w:r>
         <w:t xml:space="preserve">Uruguay</w:t>
       </w:r>
     </w:p>
@@ -6143,9 +6291,9 @@
         <w:t xml:space="preserve">Archive-bibliothèque dédiée à la mémoire libertaire, du nom de la militante et historienne Luce Fabbri.</w:t>
       </w:r>
     </w:p>
-    <w:bookmarkEnd w:id="48"/>
     <w:bookmarkEnd w:id="49"/>
-    <w:bookmarkStart w:id="52" w:name="océanie"/>
+    <w:bookmarkEnd w:id="50"/>
+    <w:bookmarkStart w:id="53" w:name="océanie"/>
     <w:p>
       <w:pPr>
         <w:pStyle w:val="Heading3"/>
@@ -6154,7 +6302,7 @@
         <w:t xml:space="preserve">Océanie</w:t>
       </w:r>
     </w:p>
-    <w:bookmarkStart w:id="50" w:name="australie"/>
+    <w:bookmarkStart w:id="51" w:name="australie"/>
     <w:p>
       <w:pPr>
         <w:pStyle w:val="Heading4"/>
@@ -6255,8 +6403,8 @@
         <w:t xml:space="preserve">Librairie et bibliothèque anarchiste de Sydney, depuis 1977.</w:t>
       </w:r>
     </w:p>
-    <w:bookmarkEnd w:id="50"/>
-    <w:bookmarkStart w:id="51" w:name="nouvelle-zélande"/>
+    <w:bookmarkEnd w:id="51"/>
+    <w:bookmarkStart w:id="52" w:name="nouvelle-zélande"/>
     <w:p>
       <w:pPr>
         <w:pStyle w:val="Heading4"/>
@@ -6305,9 +6453,9 @@
         <w:t xml:space="preserve">Infoshop anarchiste, distribution de livres et de presse militante.</w:t>
       </w:r>
     </w:p>
-    <w:bookmarkEnd w:id="51"/>
     <w:bookmarkEnd w:id="52"/>
-    <w:bookmarkStart w:id="54" w:name="asie"/>
+    <w:bookmarkEnd w:id="53"/>
+    <w:bookmarkStart w:id="55" w:name="asie"/>
     <w:p>
       <w:pPr>
         <w:pStyle w:val="Heading3"/>
@@ -6316,7 +6464,7 @@
         <w:t xml:space="preserve">Asie</w:t>
       </w:r>
     </w:p>
-    <w:bookmarkStart w:id="53" w:name="népal"/>
+    <w:bookmarkStart w:id="54" w:name="népal"/>
     <w:p>
       <w:pPr>
         <w:pStyle w:val="Heading4"/>
@@ -6365,10 +6513,10 @@
         <w:t xml:space="preserve">Petite bibliothèque anarchiste en accès libre, ouverte en 2024.</w:t>
       </w:r>
     </w:p>
-    <w:bookmarkEnd w:id="53"/>
     <w:bookmarkEnd w:id="54"/>
     <w:bookmarkEnd w:id="55"/>
-    <w:bookmarkStart w:id="56" w:name="sources-et-pistes-de-vérification"/>
+    <w:bookmarkEnd w:id="56"/>
+    <w:bookmarkStart w:id="57" w:name="sources-et-pistes-de-vérification"/>
     <w:p>
       <w:pPr>
         <w:pStyle w:val="Heading2"/>
@@ -6534,8 +6682,8 @@
         <w:t xml:space="preserve">paraît détourné par du spam : passer par la page Facebook du collectif pour tout contact.</w:t>
       </w:r>
     </w:p>
-    <w:bookmarkEnd w:id="56"/>
     <w:bookmarkEnd w:id="57"/>
+    <w:bookmarkEnd w:id="58"/>
     <w:sectPr/>
   </w:body>
 </w:document>

</xml_diff>

<commit_message>
docs: ajout du recensement des bibliotheques libertaires
</commit_message>
<xml_diff>
--- a/docs/decisions/AnarBib_recensement_bibliotheques_libertaires.docx
+++ b/docs/decisions/AnarBib_recensement_bibliotheques_libertaires.docx
@@ -330,7 +330,7 @@
           <w:bCs/>
           <w:b/>
         </w:rPr>
-        <w:t xml:space="preserve">102 lieux</w:t>
+        <w:t xml:space="preserve">105 lieux</w:t>
       </w:r>
       <w:r>
         <w:t xml:space="preserve"> </w:t>
@@ -442,7 +442,7 @@
               <w:jc w:val="left"/>
             </w:pPr>
             <w:r>
-              <w:t xml:space="preserve">65</w:t>
+              <w:t xml:space="preserve">68</w:t>
             </w:r>
           </w:p>
         </w:tc>
@@ -2976,6 +2976,52 @@
           <w:bCs/>
           <w:b/>
         </w:rPr>
+        <w:t xml:space="preserve">La Parole Errante — Maison de l’arbre / Archives Armand Gatti</w:t>
+      </w:r>
+      <w:r>
+        <w:br/>
+      </w:r>
+      <w:r>
+        <w:rPr>
+          <w:iCs/>
+          <w:i/>
+        </w:rPr>
+        <w:t xml:space="preserve">Lieu mixte (bibliothèque + librairie / infoshop) — Montreuil</w:t>
+      </w:r>
+      <w:r>
+        <w:br/>
+      </w:r>
+      <w:r>
+        <w:t xml:space="preserve">Adresse : 9 rue François Debergue, 93100 Montreuil</w:t>
+      </w:r>
+      <w:r>
+        <w:br/>
+      </w:r>
+      <w:r>
+        <w:t xml:space="preserve">Site : https://laparoleerrante.org/</w:t>
+      </w:r>
+      <w:r>
+        <w:br/>
+      </w:r>
+      <w:r>
+        <w:t xml:space="preserve">Coordonnées : 48.858, 2.438 (adresse géocodée) · Langues du fonds : fr</w:t>
+      </w:r>
+      <w:r>
+        <w:br/>
+      </w:r>
+      <w:r>
+        <w:t xml:space="preserve">Centre culturel libertaire et antifasciste autogéré, à la Maison de l’arbre. Abrite des archives liées à Armand Gatti et un fonds de l’édition militante. Lieu de spectacles, rencontres et luttes.</w:t>
+      </w:r>
+    </w:p>
+    <w:p>
+      <w:pPr>
+        <w:pStyle w:val="BodyText"/>
+      </w:pPr>
+      <w:r>
+        <w:rPr>
+          <w:bCs/>
+          <w:b/>
+        </w:rPr>
         <w:t xml:space="preserve">Centre de Documentation Anarchiste (CDA) — Librairie du Monde libertaire</w:t>
       </w:r>
       <w:r>
@@ -3103,6 +3149,98 @@
       </w:r>
       <w:r>
         <w:t xml:space="preserve">Bibliothèque anarchiste parisienne, lieu de rencontres et de lectures.</w:t>
+      </w:r>
+    </w:p>
+    <w:p>
+      <w:pPr>
+        <w:pStyle w:val="BodyText"/>
+      </w:pPr>
+      <w:r>
+        <w:rPr>
+          <w:bCs/>
+          <w:b/>
+        </w:rPr>
+        <w:t xml:space="preserve">Bibliothèque La Rue — Groupe Libertaire La Rue (Louise-Michel)</w:t>
+      </w:r>
+      <w:r>
+        <w:br/>
+      </w:r>
+      <w:r>
+        <w:rPr>
+          <w:iCs/>
+          <w:i/>
+        </w:rPr>
+        <w:t xml:space="preserve">Bibliothèque — Paris</w:t>
+      </w:r>
+      <w:r>
+        <w:br/>
+      </w:r>
+      <w:r>
+        <w:t xml:space="preserve">Adresse : 10 rue Robert Planquette, 75018 Paris</w:t>
+      </w:r>
+      <w:r>
+        <w:br/>
+      </w:r>
+      <w:r>
+        <w:t xml:space="preserve">Site : https://groupe-libertaire-la-rue.jimdosite.com/</w:t>
+      </w:r>
+      <w:r>
+        <w:br/>
+      </w:r>
+      <w:r>
+        <w:t xml:space="preserve">Coordonnées : 48.8847, 2.3354 (adresse géocodée) · Langues du fonds : fr</w:t>
+      </w:r>
+      <w:r>
+        <w:br/>
+      </w:r>
+      <w:r>
+        <w:t xml:space="preserve">Bibliothèque sociale du Groupe Libertaire La Rue (groupe Louise-Michel), anarchisme social. Lieu de réunions, débats et conférences du groupe. « La Rue » est aussi le titre d’une revue publiée par le groupe de 1967 à 1986 (37 numéros), en cours de numérisation.</w:t>
+      </w:r>
+    </w:p>
+    <w:p>
+      <w:pPr>
+        <w:pStyle w:val="BodyText"/>
+      </w:pPr>
+      <w:r>
+        <w:rPr>
+          <w:bCs/>
+          <w:b/>
+        </w:rPr>
+        <w:t xml:space="preserve">Bibliothèque anarchiste Libertad</w:t>
+      </w:r>
+      <w:r>
+        <w:br/>
+      </w:r>
+      <w:r>
+        <w:rPr>
+          <w:iCs/>
+          <w:i/>
+        </w:rPr>
+        <w:t xml:space="preserve">Bibliothèque — Paris</w:t>
+      </w:r>
+      <w:r>
+        <w:br/>
+      </w:r>
+      <w:r>
+        <w:t xml:space="preserve">Adresse : 19 rue Burnouf, 75019 Paris</w:t>
+      </w:r>
+      <w:r>
+        <w:br/>
+      </w:r>
+      <w:r>
+        <w:t xml:space="preserve">Site : https://bibliothequelibertad.noblogs.org/ · Courriel : bibliothequelibertad@riseup.net</w:t>
+      </w:r>
+      <w:r>
+        <w:br/>
+      </w:r>
+      <w:r>
+        <w:t xml:space="preserve">Coordonnées : 48.8786, 2.3736 (adresse géocodée) · Langues du fonds : fr</w:t>
+      </w:r>
+      <w:r>
+        <w:br/>
+      </w:r>
+      <w:r>
+        <w:t xml:space="preserve">Bibliothèque anarchiste : emprunt de livres sans barrière d’argent, archives, infokiosque de brochures et tracts. Permanences le mardi 17h-20h, discussions et rencontres le jeudi. Métro Belleville / Colonel Fabien.</w:t>
       </w:r>
     </w:p>
     <w:p>

</xml_diff>